<commit_message>
docs: add training walk-forward vs holdout MAPE table to report V4
Section 3.4 described the two-step selection process (train-only
walk-forward decides the winner, 2025 holdout reports it afterward) but
never showed the walk-forward numbers themselves, only the holdout half.
Adds the missing table plus a short paragraph clarifying that the two
MAPE figures measure different things and aren't expected to match.
Values verified against data/outputs/model_selection_walkforward.csv.

Co-Authored-By: Claude Sonnet 4.6 <noreply@anthropic.com>
</commit_message>
<xml_diff>
--- a/Final Report/Repsol_EcoFuels_Project_Report_Draft_V4.docx
+++ b/Final Report/Repsol_EcoFuels_Project_Report_Draft_V4.docx
@@ -2685,6 +2685,553 @@
         <w:t>This is important because it prevents the final evaluation period from influencing the selected model.</w:t>
       </w:r>
     </w:p>
+    <w:p>
+      <w:r>
+        <w:rPr>
+          <w:rFonts w:ascii="Times New Roman" w:hAnsi="Times New Roman"/>
+          <w:sz w:val="24"/>
+        </w:rPr>
+        <w:t>The table below shows both halves of this process for each target: the training walk-forward MAPE that actually decided which of the seven candidates won, computed entirely from 2023-2024 data, and the 2025 holdout MAPE reported afterward for that same already-selected model. The two numbers measure different things and are not expected to match: the first is the multi-candidate ranking signal used for selection, the second is an honest accuracy check on data the selection process never saw. Scores for all seven candidates per target are in data/outputs/model_selection_walkforward.csv.</w:t>
+      </w:r>
+    </w:p>
+    <w:tbl>
+      <w:tblPr>
+        <w:tblW w:type="auto" w:w="0"/>
+        <w:jc w:val="center"/>
+        <w:tblLook w:firstColumn="1" w:firstRow="1" w:lastColumn="0" w:lastRow="0" w:noHBand="0" w:noVBand="1" w:val="04A0"/>
+      </w:tblPr>
+      <w:tblGrid>
+        <w:gridCol w:w="2462"/>
+        <w:gridCol w:w="2462"/>
+        <w:gridCol w:w="2462"/>
+        <w:gridCol w:w="2462"/>
+      </w:tblGrid>
+      <w:tr>
+        <w:tc>
+          <w:tcPr>
+            <w:tcW w:type="dxa" w:w="2462"/>
+            <w:shd w:val="clear" w:fill="FFF3C4"/>
+            <w:tcBorders>
+              <w:top w:val="single" w:sz="4" w:color="C9C9C9"/>
+              <w:left w:val="single" w:sz="4" w:color="C9C9C9"/>
+              <w:bottom w:val="single" w:sz="4" w:color="C9C9C9"/>
+              <w:right w:val="single" w:sz="4" w:color="C9C9C9"/>
+            </w:tcBorders>
+          </w:tcPr>
+          <w:p>
+            <w:r/>
+            <w:r>
+              <w:rPr>
+                <w:rFonts w:ascii="Times New Roman" w:hAnsi="Times New Roman"/>
+                <w:b/>
+                <w:sz w:val="20"/>
+              </w:rPr>
+              <w:t>Target</w:t>
+            </w:r>
+          </w:p>
+        </w:tc>
+        <w:tc>
+          <w:tcPr>
+            <w:tcW w:type="dxa" w:w="2462"/>
+            <w:shd w:val="clear" w:fill="FFF3C4"/>
+            <w:tcBorders>
+              <w:top w:val="single" w:sz="4" w:color="C9C9C9"/>
+              <w:left w:val="single" w:sz="4" w:color="C9C9C9"/>
+              <w:bottom w:val="single" w:sz="4" w:color="C9C9C9"/>
+              <w:right w:val="single" w:sz="4" w:color="C9C9C9"/>
+            </w:tcBorders>
+          </w:tcPr>
+          <w:p>
+            <w:r/>
+            <w:r>
+              <w:rPr>
+                <w:rFonts w:ascii="Times New Roman" w:hAnsi="Times New Roman"/>
+                <w:b/>
+                <w:sz w:val="20"/>
+              </w:rPr>
+              <w:t>Selected Model</w:t>
+            </w:r>
+          </w:p>
+        </w:tc>
+        <w:tc>
+          <w:tcPr>
+            <w:tcW w:type="dxa" w:w="2462"/>
+            <w:shd w:val="clear" w:fill="FFF3C4"/>
+            <w:tcBorders>
+              <w:top w:val="single" w:sz="4" w:color="C9C9C9"/>
+              <w:left w:val="single" w:sz="4" w:color="C9C9C9"/>
+              <w:bottom w:val="single" w:sz="4" w:color="C9C9C9"/>
+              <w:right w:val="single" w:sz="4" w:color="C9C9C9"/>
+            </w:tcBorders>
+          </w:tcPr>
+          <w:p>
+            <w:r/>
+            <w:r>
+              <w:rPr>
+                <w:rFonts w:ascii="Times New Roman" w:hAnsi="Times New Roman"/>
+                <w:b/>
+                <w:sz w:val="20"/>
+              </w:rPr>
+              <w:t>Training Walk-Forward MAPE</w:t>
+            </w:r>
+          </w:p>
+        </w:tc>
+        <w:tc>
+          <w:tcPr>
+            <w:tcW w:type="dxa" w:w="2462"/>
+            <w:shd w:val="clear" w:fill="FFF3C4"/>
+            <w:tcBorders>
+              <w:top w:val="single" w:sz="4" w:color="C9C9C9"/>
+              <w:left w:val="single" w:sz="4" w:color="C9C9C9"/>
+              <w:bottom w:val="single" w:sz="4" w:color="C9C9C9"/>
+              <w:right w:val="single" w:sz="4" w:color="C9C9C9"/>
+            </w:tcBorders>
+          </w:tcPr>
+          <w:p>
+            <w:r/>
+            <w:r>
+              <w:rPr>
+                <w:rFonts w:ascii="Times New Roman" w:hAnsi="Times New Roman"/>
+                <w:b/>
+                <w:sz w:val="20"/>
+              </w:rPr>
+              <w:t>2025 Holdout MAPE</w:t>
+            </w:r>
+          </w:p>
+        </w:tc>
+      </w:tr>
+      <w:tr>
+        <w:tc>
+          <w:tcPr>
+            <w:tcW w:type="dxa" w:w="2462"/>
+            <w:tcBorders>
+              <w:top w:val="single" w:sz="4" w:color="C9C9C9"/>
+              <w:left w:val="single" w:sz="4" w:color="C9C9C9"/>
+              <w:bottom w:val="single" w:sz="4" w:color="C9C9C9"/>
+              <w:right w:val="single" w:sz="4" w:color="C9C9C9"/>
+            </w:tcBorders>
+          </w:tcPr>
+          <w:p>
+            <w:r/>
+            <w:r>
+              <w:rPr>
+                <w:rFonts w:ascii="Times New Roman" w:hAnsi="Times New Roman"/>
+                <w:sz w:val="19"/>
+              </w:rPr>
+              <w:t>Nacional</w:t>
+            </w:r>
+          </w:p>
+        </w:tc>
+        <w:tc>
+          <w:tcPr>
+            <w:tcW w:type="dxa" w:w="2462"/>
+            <w:tcBorders>
+              <w:top w:val="single" w:sz="4" w:color="C9C9C9"/>
+              <w:left w:val="single" w:sz="4" w:color="C9C9C9"/>
+              <w:bottom w:val="single" w:sz="4" w:color="C9C9C9"/>
+              <w:right w:val="single" w:sz="4" w:color="C9C9C9"/>
+            </w:tcBorders>
+          </w:tcPr>
+          <w:p>
+            <w:r/>
+            <w:r>
+              <w:rPr>
+                <w:rFonts w:ascii="Times New Roman" w:hAnsi="Times New Roman"/>
+                <w:sz w:val="19"/>
+              </w:rPr>
+              <w:t>Logistic</w:t>
+            </w:r>
+          </w:p>
+        </w:tc>
+        <w:tc>
+          <w:tcPr>
+            <w:tcW w:type="dxa" w:w="2462"/>
+            <w:tcBorders>
+              <w:top w:val="single" w:sz="4" w:color="C9C9C9"/>
+              <w:left w:val="single" w:sz="4" w:color="C9C9C9"/>
+              <w:bottom w:val="single" w:sz="4" w:color="C9C9C9"/>
+              <w:right w:val="single" w:sz="4" w:color="C9C9C9"/>
+            </w:tcBorders>
+          </w:tcPr>
+          <w:p>
+            <w:r/>
+            <w:r>
+              <w:rPr>
+                <w:rFonts w:ascii="Times New Roman" w:hAnsi="Times New Roman"/>
+                <w:sz w:val="19"/>
+              </w:rPr>
+              <w:t>43.1%</w:t>
+            </w:r>
+          </w:p>
+        </w:tc>
+        <w:tc>
+          <w:tcPr>
+            <w:tcW w:type="dxa" w:w="2462"/>
+            <w:tcBorders>
+              <w:top w:val="single" w:sz="4" w:color="C9C9C9"/>
+              <w:left w:val="single" w:sz="4" w:color="C9C9C9"/>
+              <w:bottom w:val="single" w:sz="4" w:color="C9C9C9"/>
+              <w:right w:val="single" w:sz="4" w:color="C9C9C9"/>
+            </w:tcBorders>
+          </w:tcPr>
+          <w:p>
+            <w:r/>
+            <w:r>
+              <w:rPr>
+                <w:rFonts w:ascii="Times New Roman" w:hAnsi="Times New Roman"/>
+                <w:sz w:val="19"/>
+              </w:rPr>
+              <w:t>36.7%</w:t>
+            </w:r>
+          </w:p>
+        </w:tc>
+      </w:tr>
+      <w:tr>
+        <w:tc>
+          <w:tcPr>
+            <w:tcW w:type="dxa" w:w="2462"/>
+            <w:tcBorders>
+              <w:top w:val="single" w:sz="4" w:color="C9C9C9"/>
+              <w:left w:val="single" w:sz="4" w:color="C9C9C9"/>
+              <w:bottom w:val="single" w:sz="4" w:color="C9C9C9"/>
+              <w:right w:val="single" w:sz="4" w:color="C9C9C9"/>
+            </w:tcBorders>
+          </w:tcPr>
+          <w:p>
+            <w:r/>
+            <w:r>
+              <w:rPr>
+                <w:rFonts w:ascii="Times New Roman" w:hAnsi="Times New Roman"/>
+                <w:sz w:val="19"/>
+              </w:rPr>
+              <w:t>Madrid</w:t>
+            </w:r>
+          </w:p>
+        </w:tc>
+        <w:tc>
+          <w:tcPr>
+            <w:tcW w:type="dxa" w:w="2462"/>
+            <w:tcBorders>
+              <w:top w:val="single" w:sz="4" w:color="C9C9C9"/>
+              <w:left w:val="single" w:sz="4" w:color="C9C9C9"/>
+              <w:bottom w:val="single" w:sz="4" w:color="C9C9C9"/>
+              <w:right w:val="single" w:sz="4" w:color="C9C9C9"/>
+            </w:tcBorders>
+          </w:tcPr>
+          <w:p>
+            <w:r/>
+            <w:r>
+              <w:rPr>
+                <w:rFonts w:ascii="Times New Roman" w:hAnsi="Times New Roman"/>
+                <w:sz w:val="19"/>
+              </w:rPr>
+              <w:t>Logistic</w:t>
+            </w:r>
+          </w:p>
+        </w:tc>
+        <w:tc>
+          <w:tcPr>
+            <w:tcW w:type="dxa" w:w="2462"/>
+            <w:tcBorders>
+              <w:top w:val="single" w:sz="4" w:color="C9C9C9"/>
+              <w:left w:val="single" w:sz="4" w:color="C9C9C9"/>
+              <w:bottom w:val="single" w:sz="4" w:color="C9C9C9"/>
+              <w:right w:val="single" w:sz="4" w:color="C9C9C9"/>
+            </w:tcBorders>
+          </w:tcPr>
+          <w:p>
+            <w:r/>
+            <w:r>
+              <w:rPr>
+                <w:rFonts w:ascii="Times New Roman" w:hAnsi="Times New Roman"/>
+                <w:sz w:val="19"/>
+              </w:rPr>
+              <w:t>37.2%</w:t>
+            </w:r>
+          </w:p>
+        </w:tc>
+        <w:tc>
+          <w:tcPr>
+            <w:tcW w:type="dxa" w:w="2462"/>
+            <w:tcBorders>
+              <w:top w:val="single" w:sz="4" w:color="C9C9C9"/>
+              <w:left w:val="single" w:sz="4" w:color="C9C9C9"/>
+              <w:bottom w:val="single" w:sz="4" w:color="C9C9C9"/>
+              <w:right w:val="single" w:sz="4" w:color="C9C9C9"/>
+            </w:tcBorders>
+          </w:tcPr>
+          <w:p>
+            <w:r/>
+            <w:r>
+              <w:rPr>
+                <w:rFonts w:ascii="Times New Roman" w:hAnsi="Times New Roman"/>
+                <w:sz w:val="19"/>
+              </w:rPr>
+              <w:t>73.6%</w:t>
+            </w:r>
+          </w:p>
+        </w:tc>
+      </w:tr>
+      <w:tr>
+        <w:tc>
+          <w:tcPr>
+            <w:tcW w:type="dxa" w:w="2462"/>
+            <w:tcBorders>
+              <w:top w:val="single" w:sz="4" w:color="C9C9C9"/>
+              <w:left w:val="single" w:sz="4" w:color="C9C9C9"/>
+              <w:bottom w:val="single" w:sz="4" w:color="C9C9C9"/>
+              <w:right w:val="single" w:sz="4" w:color="C9C9C9"/>
+            </w:tcBorders>
+          </w:tcPr>
+          <w:p>
+            <w:r/>
+            <w:r>
+              <w:rPr>
+                <w:rFonts w:ascii="Times New Roman" w:hAnsi="Times New Roman"/>
+                <w:sz w:val="19"/>
+              </w:rPr>
+              <w:t>Cataluña</w:t>
+            </w:r>
+          </w:p>
+        </w:tc>
+        <w:tc>
+          <w:tcPr>
+            <w:tcW w:type="dxa" w:w="2462"/>
+            <w:tcBorders>
+              <w:top w:val="single" w:sz="4" w:color="C9C9C9"/>
+              <w:left w:val="single" w:sz="4" w:color="C9C9C9"/>
+              <w:bottom w:val="single" w:sz="4" w:color="C9C9C9"/>
+              <w:right w:val="single" w:sz="4" w:color="C9C9C9"/>
+            </w:tcBorders>
+          </w:tcPr>
+          <w:p>
+            <w:r/>
+            <w:r>
+              <w:rPr>
+                <w:rFonts w:ascii="Times New Roman" w:hAnsi="Times New Roman"/>
+                <w:sz w:val="19"/>
+              </w:rPr>
+              <w:t>SARIMA</w:t>
+            </w:r>
+          </w:p>
+        </w:tc>
+        <w:tc>
+          <w:tcPr>
+            <w:tcW w:type="dxa" w:w="2462"/>
+            <w:tcBorders>
+              <w:top w:val="single" w:sz="4" w:color="C9C9C9"/>
+              <w:left w:val="single" w:sz="4" w:color="C9C9C9"/>
+              <w:bottom w:val="single" w:sz="4" w:color="C9C9C9"/>
+              <w:right w:val="single" w:sz="4" w:color="C9C9C9"/>
+            </w:tcBorders>
+          </w:tcPr>
+          <w:p>
+            <w:r/>
+            <w:r>
+              <w:rPr>
+                <w:rFonts w:ascii="Times New Roman" w:hAnsi="Times New Roman"/>
+                <w:sz w:val="19"/>
+              </w:rPr>
+              <w:t>66.9%</w:t>
+            </w:r>
+          </w:p>
+        </w:tc>
+        <w:tc>
+          <w:tcPr>
+            <w:tcW w:type="dxa" w:w="2462"/>
+            <w:tcBorders>
+              <w:top w:val="single" w:sz="4" w:color="C9C9C9"/>
+              <w:left w:val="single" w:sz="4" w:color="C9C9C9"/>
+              <w:bottom w:val="single" w:sz="4" w:color="C9C9C9"/>
+              <w:right w:val="single" w:sz="4" w:color="C9C9C9"/>
+            </w:tcBorders>
+          </w:tcPr>
+          <w:p>
+            <w:r/>
+            <w:r>
+              <w:rPr>
+                <w:rFonts w:ascii="Times New Roman" w:hAnsi="Times New Roman"/>
+                <w:sz w:val="19"/>
+              </w:rPr>
+              <w:t>50.1%</w:t>
+            </w:r>
+          </w:p>
+        </w:tc>
+      </w:tr>
+      <w:tr>
+        <w:tc>
+          <w:tcPr>
+            <w:tcW w:type="dxa" w:w="2462"/>
+            <w:tcBorders>
+              <w:top w:val="single" w:sz="4" w:color="C9C9C9"/>
+              <w:left w:val="single" w:sz="4" w:color="C9C9C9"/>
+              <w:bottom w:val="single" w:sz="4" w:color="C9C9C9"/>
+              <w:right w:val="single" w:sz="4" w:color="C9C9C9"/>
+            </w:tcBorders>
+          </w:tcPr>
+          <w:p>
+            <w:r/>
+            <w:r>
+              <w:rPr>
+                <w:rFonts w:ascii="Times New Roman" w:hAnsi="Times New Roman"/>
+                <w:sz w:val="19"/>
+              </w:rPr>
+              <w:t>Andalucía</w:t>
+            </w:r>
+          </w:p>
+        </w:tc>
+        <w:tc>
+          <w:tcPr>
+            <w:tcW w:type="dxa" w:w="2462"/>
+            <w:tcBorders>
+              <w:top w:val="single" w:sz="4" w:color="C9C9C9"/>
+              <w:left w:val="single" w:sz="4" w:color="C9C9C9"/>
+              <w:bottom w:val="single" w:sz="4" w:color="C9C9C9"/>
+              <w:right w:val="single" w:sz="4" w:color="C9C9C9"/>
+            </w:tcBorders>
+          </w:tcPr>
+          <w:p>
+            <w:r/>
+            <w:r>
+              <w:rPr>
+                <w:rFonts w:ascii="Times New Roman" w:hAnsi="Times New Roman"/>
+                <w:sz w:val="19"/>
+              </w:rPr>
+              <w:t>SARIMA</w:t>
+            </w:r>
+          </w:p>
+        </w:tc>
+        <w:tc>
+          <w:tcPr>
+            <w:tcW w:type="dxa" w:w="2462"/>
+            <w:tcBorders>
+              <w:top w:val="single" w:sz="4" w:color="C9C9C9"/>
+              <w:left w:val="single" w:sz="4" w:color="C9C9C9"/>
+              <w:bottom w:val="single" w:sz="4" w:color="C9C9C9"/>
+              <w:right w:val="single" w:sz="4" w:color="C9C9C9"/>
+            </w:tcBorders>
+          </w:tcPr>
+          <w:p>
+            <w:r/>
+            <w:r>
+              <w:rPr>
+                <w:rFonts w:ascii="Times New Roman" w:hAnsi="Times New Roman"/>
+                <w:sz w:val="19"/>
+              </w:rPr>
+              <w:t>48.8%</w:t>
+            </w:r>
+          </w:p>
+        </w:tc>
+        <w:tc>
+          <w:tcPr>
+            <w:tcW w:type="dxa" w:w="2462"/>
+            <w:tcBorders>
+              <w:top w:val="single" w:sz="4" w:color="C9C9C9"/>
+              <w:left w:val="single" w:sz="4" w:color="C9C9C9"/>
+              <w:bottom w:val="single" w:sz="4" w:color="C9C9C9"/>
+              <w:right w:val="single" w:sz="4" w:color="C9C9C9"/>
+            </w:tcBorders>
+          </w:tcPr>
+          <w:p>
+            <w:r/>
+            <w:r>
+              <w:rPr>
+                <w:rFonts w:ascii="Times New Roman" w:hAnsi="Times New Roman"/>
+                <w:sz w:val="19"/>
+              </w:rPr>
+              <w:t>52.6%</w:t>
+            </w:r>
+          </w:p>
+        </w:tc>
+      </w:tr>
+      <w:tr>
+        <w:tc>
+          <w:tcPr>
+            <w:tcW w:type="dxa" w:w="2462"/>
+            <w:tcBorders>
+              <w:top w:val="single" w:sz="4" w:color="C9C9C9"/>
+              <w:left w:val="single" w:sz="4" w:color="C9C9C9"/>
+              <w:bottom w:val="single" w:sz="4" w:color="C9C9C9"/>
+              <w:right w:val="single" w:sz="4" w:color="C9C9C9"/>
+            </w:tcBorders>
+          </w:tcPr>
+          <w:p>
+            <w:r/>
+            <w:r>
+              <w:rPr>
+                <w:rFonts w:ascii="Times New Roman" w:hAnsi="Times New Roman"/>
+                <w:sz w:val="19"/>
+              </w:rPr>
+              <w:t>Valencia</w:t>
+            </w:r>
+          </w:p>
+        </w:tc>
+        <w:tc>
+          <w:tcPr>
+            <w:tcW w:type="dxa" w:w="2462"/>
+            <w:tcBorders>
+              <w:top w:val="single" w:sz="4" w:color="C9C9C9"/>
+              <w:left w:val="single" w:sz="4" w:color="C9C9C9"/>
+              <w:bottom w:val="single" w:sz="4" w:color="C9C9C9"/>
+              <w:right w:val="single" w:sz="4" w:color="C9C9C9"/>
+            </w:tcBorders>
+          </w:tcPr>
+          <w:p>
+            <w:r/>
+            <w:r>
+              <w:rPr>
+                <w:rFonts w:ascii="Times New Roman" w:hAnsi="Times New Roman"/>
+                <w:sz w:val="19"/>
+              </w:rPr>
+              <w:t>Gompertz</w:t>
+            </w:r>
+          </w:p>
+        </w:tc>
+        <w:tc>
+          <w:tcPr>
+            <w:tcW w:type="dxa" w:w="2462"/>
+            <w:tcBorders>
+              <w:top w:val="single" w:sz="4" w:color="C9C9C9"/>
+              <w:left w:val="single" w:sz="4" w:color="C9C9C9"/>
+              <w:bottom w:val="single" w:sz="4" w:color="C9C9C9"/>
+              <w:right w:val="single" w:sz="4" w:color="C9C9C9"/>
+            </w:tcBorders>
+          </w:tcPr>
+          <w:p>
+            <w:r/>
+            <w:r>
+              <w:rPr>
+                <w:rFonts w:ascii="Times New Roman" w:hAnsi="Times New Roman"/>
+                <w:sz w:val="19"/>
+              </w:rPr>
+              <w:t>57.3%</w:t>
+            </w:r>
+          </w:p>
+        </w:tc>
+        <w:tc>
+          <w:tcPr>
+            <w:tcW w:type="dxa" w:w="2462"/>
+            <w:tcBorders>
+              <w:top w:val="single" w:sz="4" w:color="C9C9C9"/>
+              <w:left w:val="single" w:sz="4" w:color="C9C9C9"/>
+              <w:bottom w:val="single" w:sz="4" w:color="C9C9C9"/>
+              <w:right w:val="single" w:sz="4" w:color="C9C9C9"/>
+            </w:tcBorders>
+          </w:tcPr>
+          <w:p>
+            <w:r/>
+            <w:r>
+              <w:rPr>
+                <w:rFonts w:ascii="Times New Roman" w:hAnsi="Times New Roman"/>
+                <w:sz w:val="19"/>
+              </w:rPr>
+              <w:t>34.2%</w:t>
+            </w:r>
+          </w:p>
+        </w:tc>
+      </w:tr>
+    </w:tbl>
+    <w:p/>
     <w:p>
       <w:r>
         <w:t>The final metrics are:</w:t>

</xml_diff>

<commit_message>
docs: add mini trend model cross-check section to report V4
Adds Section 5.11, adapted from notebooks/12's own cross-check against
the independent mini trend model (notebook 11): a comparison table
against data/outputs/mini_model_cross_check.csv plus analysis of why
Valencia matches exactly, why Nacional/Madrid look close for the wrong
reason (Logistic vs Gompertz are barely distinguishable on this data),
and why Cataluna/Andalucia diverge structurally (production sits below
even the mini model's Conservative scenario for both). Placed right
after 5.10 and before the Conclusions section, capping off the model
validation arc with an independent sanity check. Also set the new
table's header row to repeat across the page break it spans.

Co-Authored-By: Claude Sonnet 4.6 <noreply@anthropic.com>
</commit_message>
<xml_diff>
--- a/Final Report/Repsol_EcoFuels_Project_Report_Draft_V4.docx
+++ b/Final Report/Repsol_EcoFuels_Project_Report_Draft_V4.docx
@@ -6136,6 +6136,970 @@
     <w:p>
       <w:r>
         <w:t>The answer is a deliberate design choice, not an oversight. This project's standing modeling philosophy is one independently-fit model per region: every target is free to be won by any of the seven candidate families, but the winning model's parameters must come entirely from that region's own history. A model whose splits or coefficients are also shaped by another region's rows, however useful that extra data might be, is a different kind of object than "the best model for this region," which is the actual design goal here. Pooling is excluded for that reason, not because the holdout comparison above was unfair to it; that comparison is real and intentionally disclosed precisely so the tradeoff is visible to Repsol rather than hidden. The pooled results remain available in the project's diagnostic outputs as a transparent sensitivity comparison, and are a natural first place to look if more historical data per region becomes available and the one-model-per-region constraint is revisited.</w:t>
+      </w:r>
+    </w:p>
+    <w:p>
+      <w:pPr>
+        <w:pStyle w:val="Heading2"/>
+      </w:pPr>
+      <w:r>
+        <w:t>5.11 Cross-Check Against an Independent Mini Trend Model</w:t>
+      </w:r>
+    </w:p>
+    <w:p>
+      <w:r>
+        <w:t>A separate, deliberately simple model provides an independent check on the selected forecasts above. notebooks/11_mini_trend_regulation_model.ipynb fits its own Logistic or Gompertz curve per target, choosing whichever has the higher in-sample R2, with no walk-forward validation, and saves three illustrative scenarios (Conservative, Central, and Optimistic, a 0.5x/1.0x/1.5x pace factor on the fitted growth) to data/outputs/mini_model_scenarios.csv. It is intentionally not reconciled with the production forecast; the comparison below checks how far apart the two actually are, and why.</w:t>
+      </w:r>
+    </w:p>
+    <w:p/>
+    <w:tbl>
+      <w:tblPr>
+        <w:tblW w:type="auto" w:w="0"/>
+        <w:jc w:val="center"/>
+        <w:tblLook w:firstColumn="1" w:firstRow="1" w:lastColumn="0" w:lastRow="0" w:noHBand="0" w:noVBand="1" w:val="04A0"/>
+      </w:tblPr>
+      <w:tblGrid>
+        <w:gridCol w:w="1407"/>
+        <w:gridCol w:w="1407"/>
+        <w:gridCol w:w="1407"/>
+        <w:gridCol w:w="1407"/>
+        <w:gridCol w:w="1407"/>
+        <w:gridCol w:w="1407"/>
+        <w:gridCol w:w="1407"/>
+      </w:tblGrid>
+      <w:tr>
+        <w:trPr>
+          <w:tblHeader w:val="true"/>
+        </w:trPr>
+        <w:tc>
+          <w:tcPr>
+            <w:tcW w:type="dxa" w:w="1407"/>
+            <w:shd w:val="clear" w:fill="FFF3C4"/>
+            <w:tcBorders>
+              <w:top w:val="single" w:sz="4" w:color="C9C9C9"/>
+              <w:left w:val="single" w:sz="4" w:color="C9C9C9"/>
+              <w:bottom w:val="single" w:sz="4" w:color="C9C9C9"/>
+              <w:right w:val="single" w:sz="4" w:color="C9C9C9"/>
+            </w:tcBorders>
+          </w:tcPr>
+          <w:p>
+            <w:r/>
+            <w:r>
+              <w:rPr>
+                <w:rFonts w:ascii="Times New Roman" w:hAnsi="Times New Roman"/>
+                <w:b/>
+                <w:sz w:val="18"/>
+              </w:rPr>
+              <w:t>Target</w:t>
+            </w:r>
+          </w:p>
+        </w:tc>
+        <w:tc>
+          <w:tcPr>
+            <w:tcW w:type="dxa" w:w="1407"/>
+            <w:shd w:val="clear" w:fill="FFF3C4"/>
+            <w:tcBorders>
+              <w:top w:val="single" w:sz="4" w:color="C9C9C9"/>
+              <w:left w:val="single" w:sz="4" w:color="C9C9C9"/>
+              <w:bottom w:val="single" w:sz="4" w:color="C9C9C9"/>
+              <w:right w:val="single" w:sz="4" w:color="C9C9C9"/>
+            </w:tcBorders>
+          </w:tcPr>
+          <w:p>
+            <w:r/>
+            <w:r>
+              <w:rPr>
+                <w:rFonts w:ascii="Times New Roman" w:hAnsi="Times New Roman"/>
+                <w:b/>
+                <w:sz w:val="18"/>
+              </w:rPr>
+              <w:t>Production Model</w:t>
+            </w:r>
+          </w:p>
+        </w:tc>
+        <w:tc>
+          <w:tcPr>
+            <w:tcW w:type="dxa" w:w="1407"/>
+            <w:shd w:val="clear" w:fill="FFF3C4"/>
+            <w:tcBorders>
+              <w:top w:val="single" w:sz="4" w:color="C9C9C9"/>
+              <w:left w:val="single" w:sz="4" w:color="C9C9C9"/>
+              <w:bottom w:val="single" w:sz="4" w:color="C9C9C9"/>
+              <w:right w:val="single" w:sz="4" w:color="C9C9C9"/>
+            </w:tcBorders>
+          </w:tcPr>
+          <w:p>
+            <w:r/>
+            <w:r>
+              <w:rPr>
+                <w:rFonts w:ascii="Times New Roman" w:hAnsi="Times New Roman"/>
+                <w:b/>
+                <w:sz w:val="18"/>
+              </w:rPr>
+              <w:t>Production 24m Total (Tm)</w:t>
+            </w:r>
+          </w:p>
+        </w:tc>
+        <w:tc>
+          <w:tcPr>
+            <w:tcW w:type="dxa" w:w="1407"/>
+            <w:shd w:val="clear" w:fill="FFF3C4"/>
+            <w:tcBorders>
+              <w:top w:val="single" w:sz="4" w:color="C9C9C9"/>
+              <w:left w:val="single" w:sz="4" w:color="C9C9C9"/>
+              <w:bottom w:val="single" w:sz="4" w:color="C9C9C9"/>
+              <w:right w:val="single" w:sz="4" w:color="C9C9C9"/>
+            </w:tcBorders>
+          </w:tcPr>
+          <w:p>
+            <w:r/>
+            <w:r>
+              <w:rPr>
+                <w:rFonts w:ascii="Times New Roman" w:hAnsi="Times New Roman"/>
+                <w:b/>
+                <w:sz w:val="18"/>
+              </w:rPr>
+              <w:t>Mini Conservative (Tm)</w:t>
+            </w:r>
+          </w:p>
+        </w:tc>
+        <w:tc>
+          <w:tcPr>
+            <w:tcW w:type="dxa" w:w="1407"/>
+            <w:shd w:val="clear" w:fill="FFF3C4"/>
+            <w:tcBorders>
+              <w:top w:val="single" w:sz="4" w:color="C9C9C9"/>
+              <w:left w:val="single" w:sz="4" w:color="C9C9C9"/>
+              <w:bottom w:val="single" w:sz="4" w:color="C9C9C9"/>
+              <w:right w:val="single" w:sz="4" w:color="C9C9C9"/>
+            </w:tcBorders>
+          </w:tcPr>
+          <w:p>
+            <w:r/>
+            <w:r>
+              <w:rPr>
+                <w:rFonts w:ascii="Times New Roman" w:hAnsi="Times New Roman"/>
+                <w:b/>
+                <w:sz w:val="18"/>
+              </w:rPr>
+              <w:t>Mini Central (Tm)</w:t>
+            </w:r>
+          </w:p>
+        </w:tc>
+        <w:tc>
+          <w:tcPr>
+            <w:tcW w:type="dxa" w:w="1407"/>
+            <w:shd w:val="clear" w:fill="FFF3C4"/>
+            <w:tcBorders>
+              <w:top w:val="single" w:sz="4" w:color="C9C9C9"/>
+              <w:left w:val="single" w:sz="4" w:color="C9C9C9"/>
+              <w:bottom w:val="single" w:sz="4" w:color="C9C9C9"/>
+              <w:right w:val="single" w:sz="4" w:color="C9C9C9"/>
+            </w:tcBorders>
+          </w:tcPr>
+          <w:p>
+            <w:r/>
+            <w:r>
+              <w:rPr>
+                <w:rFonts w:ascii="Times New Roman" w:hAnsi="Times New Roman"/>
+                <w:b/>
+                <w:sz w:val="18"/>
+              </w:rPr>
+              <w:t>Mini Optimistic (Tm)</w:t>
+            </w:r>
+          </w:p>
+        </w:tc>
+        <w:tc>
+          <w:tcPr>
+            <w:tcW w:type="dxa" w:w="1407"/>
+            <w:shd w:val="clear" w:fill="FFF3C4"/>
+            <w:tcBorders>
+              <w:top w:val="single" w:sz="4" w:color="C9C9C9"/>
+              <w:left w:val="single" w:sz="4" w:color="C9C9C9"/>
+              <w:bottom w:val="single" w:sz="4" w:color="C9C9C9"/>
+              <w:right w:val="single" w:sz="4" w:color="C9C9C9"/>
+            </w:tcBorders>
+          </w:tcPr>
+          <w:p>
+            <w:r/>
+            <w:r>
+              <w:rPr>
+                <w:rFonts w:ascii="Times New Roman" w:hAnsi="Times New Roman"/>
+                <w:b/>
+                <w:sz w:val="18"/>
+              </w:rPr>
+              <w:t>Same Curve Family as Production?</w:t>
+            </w:r>
+          </w:p>
+        </w:tc>
+      </w:tr>
+      <w:tr>
+        <w:tc>
+          <w:tcPr>
+            <w:tcW w:type="dxa" w:w="1407"/>
+            <w:tcBorders>
+              <w:top w:val="single" w:sz="4" w:color="C9C9C9"/>
+              <w:left w:val="single" w:sz="4" w:color="C9C9C9"/>
+              <w:bottom w:val="single" w:sz="4" w:color="C9C9C9"/>
+              <w:right w:val="single" w:sz="4" w:color="C9C9C9"/>
+            </w:tcBorders>
+          </w:tcPr>
+          <w:p>
+            <w:r/>
+            <w:r>
+              <w:rPr>
+                <w:rFonts w:ascii="Times New Roman" w:hAnsi="Times New Roman"/>
+                <w:sz w:val="17"/>
+              </w:rPr>
+              <w:t>Nacional</w:t>
+            </w:r>
+          </w:p>
+        </w:tc>
+        <w:tc>
+          <w:tcPr>
+            <w:tcW w:type="dxa" w:w="1407"/>
+            <w:tcBorders>
+              <w:top w:val="single" w:sz="4" w:color="C9C9C9"/>
+              <w:left w:val="single" w:sz="4" w:color="C9C9C9"/>
+              <w:bottom w:val="single" w:sz="4" w:color="C9C9C9"/>
+              <w:right w:val="single" w:sz="4" w:color="C9C9C9"/>
+            </w:tcBorders>
+          </w:tcPr>
+          <w:p>
+            <w:r/>
+            <w:r>
+              <w:rPr>
+                <w:rFonts w:ascii="Times New Roman" w:hAnsi="Times New Roman"/>
+                <w:sz w:val="17"/>
+              </w:rPr>
+              <w:t>Logistic</w:t>
+            </w:r>
+          </w:p>
+        </w:tc>
+        <w:tc>
+          <w:tcPr>
+            <w:tcW w:type="dxa" w:w="1407"/>
+            <w:tcBorders>
+              <w:top w:val="single" w:sz="4" w:color="C9C9C9"/>
+              <w:left w:val="single" w:sz="4" w:color="C9C9C9"/>
+              <w:bottom w:val="single" w:sz="4" w:color="C9C9C9"/>
+              <w:right w:val="single" w:sz="4" w:color="C9C9C9"/>
+            </w:tcBorders>
+          </w:tcPr>
+          <w:p>
+            <w:r/>
+            <w:r>
+              <w:rPr>
+                <w:rFonts w:ascii="Times New Roman" w:hAnsi="Times New Roman"/>
+                <w:sz w:val="17"/>
+              </w:rPr>
+              <w:t>634,223.1</w:t>
+            </w:r>
+          </w:p>
+        </w:tc>
+        <w:tc>
+          <w:tcPr>
+            <w:tcW w:type="dxa" w:w="1407"/>
+            <w:tcBorders>
+              <w:top w:val="single" w:sz="4" w:color="C9C9C9"/>
+              <w:left w:val="single" w:sz="4" w:color="C9C9C9"/>
+              <w:bottom w:val="single" w:sz="4" w:color="C9C9C9"/>
+              <w:right w:val="single" w:sz="4" w:color="C9C9C9"/>
+            </w:tcBorders>
+          </w:tcPr>
+          <w:p>
+            <w:r/>
+            <w:r>
+              <w:rPr>
+                <w:rFonts w:ascii="Times New Roman" w:hAnsi="Times New Roman"/>
+                <w:sz w:val="17"/>
+              </w:rPr>
+              <w:t>593,573.1</w:t>
+            </w:r>
+          </w:p>
+        </w:tc>
+        <w:tc>
+          <w:tcPr>
+            <w:tcW w:type="dxa" w:w="1407"/>
+            <w:tcBorders>
+              <w:top w:val="single" w:sz="4" w:color="C9C9C9"/>
+              <w:left w:val="single" w:sz="4" w:color="C9C9C9"/>
+              <w:bottom w:val="single" w:sz="4" w:color="C9C9C9"/>
+              <w:right w:val="single" w:sz="4" w:color="C9C9C9"/>
+            </w:tcBorders>
+          </w:tcPr>
+          <w:p>
+            <w:r/>
+            <w:r>
+              <w:rPr>
+                <w:rFonts w:ascii="Times New Roman" w:hAnsi="Times New Roman"/>
+                <w:sz w:val="17"/>
+              </w:rPr>
+              <w:t>634,091.8</w:t>
+            </w:r>
+          </w:p>
+        </w:tc>
+        <w:tc>
+          <w:tcPr>
+            <w:tcW w:type="dxa" w:w="1407"/>
+            <w:tcBorders>
+              <w:top w:val="single" w:sz="4" w:color="C9C9C9"/>
+              <w:left w:val="single" w:sz="4" w:color="C9C9C9"/>
+              <w:bottom w:val="single" w:sz="4" w:color="C9C9C9"/>
+              <w:right w:val="single" w:sz="4" w:color="C9C9C9"/>
+            </w:tcBorders>
+          </w:tcPr>
+          <w:p>
+            <w:r/>
+            <w:r>
+              <w:rPr>
+                <w:rFonts w:ascii="Times New Roman" w:hAnsi="Times New Roman"/>
+                <w:sz w:val="17"/>
+              </w:rPr>
+              <w:t>674,610.3</w:t>
+            </w:r>
+          </w:p>
+        </w:tc>
+        <w:tc>
+          <w:tcPr>
+            <w:tcW w:type="dxa" w:w="1407"/>
+            <w:tcBorders>
+              <w:top w:val="single" w:sz="4" w:color="C9C9C9"/>
+              <w:left w:val="single" w:sz="4" w:color="C9C9C9"/>
+              <w:bottom w:val="single" w:sz="4" w:color="C9C9C9"/>
+              <w:right w:val="single" w:sz="4" w:color="C9C9C9"/>
+            </w:tcBorders>
+          </w:tcPr>
+          <w:p>
+            <w:r/>
+            <w:r>
+              <w:rPr>
+                <w:rFonts w:ascii="Times New Roman" w:hAnsi="Times New Roman"/>
+                <w:sz w:val="17"/>
+              </w:rPr>
+              <w:t>No</w:t>
+            </w:r>
+          </w:p>
+        </w:tc>
+      </w:tr>
+      <w:tr>
+        <w:tc>
+          <w:tcPr>
+            <w:tcW w:type="dxa" w:w="1407"/>
+            <w:tcBorders>
+              <w:top w:val="single" w:sz="4" w:color="C9C9C9"/>
+              <w:left w:val="single" w:sz="4" w:color="C9C9C9"/>
+              <w:bottom w:val="single" w:sz="4" w:color="C9C9C9"/>
+              <w:right w:val="single" w:sz="4" w:color="C9C9C9"/>
+            </w:tcBorders>
+          </w:tcPr>
+          <w:p>
+            <w:r/>
+            <w:r>
+              <w:rPr>
+                <w:rFonts w:ascii="Times New Roman" w:hAnsi="Times New Roman"/>
+                <w:sz w:val="17"/>
+              </w:rPr>
+              <w:t>Madrid</w:t>
+            </w:r>
+          </w:p>
+        </w:tc>
+        <w:tc>
+          <w:tcPr>
+            <w:tcW w:type="dxa" w:w="1407"/>
+            <w:tcBorders>
+              <w:top w:val="single" w:sz="4" w:color="C9C9C9"/>
+              <w:left w:val="single" w:sz="4" w:color="C9C9C9"/>
+              <w:bottom w:val="single" w:sz="4" w:color="C9C9C9"/>
+              <w:right w:val="single" w:sz="4" w:color="C9C9C9"/>
+            </w:tcBorders>
+          </w:tcPr>
+          <w:p>
+            <w:r/>
+            <w:r>
+              <w:rPr>
+                <w:rFonts w:ascii="Times New Roman" w:hAnsi="Times New Roman"/>
+                <w:sz w:val="17"/>
+              </w:rPr>
+              <w:t>Logistic</w:t>
+            </w:r>
+          </w:p>
+        </w:tc>
+        <w:tc>
+          <w:tcPr>
+            <w:tcW w:type="dxa" w:w="1407"/>
+            <w:tcBorders>
+              <w:top w:val="single" w:sz="4" w:color="C9C9C9"/>
+              <w:left w:val="single" w:sz="4" w:color="C9C9C9"/>
+              <w:bottom w:val="single" w:sz="4" w:color="C9C9C9"/>
+              <w:right w:val="single" w:sz="4" w:color="C9C9C9"/>
+            </w:tcBorders>
+          </w:tcPr>
+          <w:p>
+            <w:r/>
+            <w:r>
+              <w:rPr>
+                <w:rFonts w:ascii="Times New Roman" w:hAnsi="Times New Roman"/>
+                <w:sz w:val="17"/>
+              </w:rPr>
+              <w:t>90,855.8</w:t>
+            </w:r>
+          </w:p>
+        </w:tc>
+        <w:tc>
+          <w:tcPr>
+            <w:tcW w:type="dxa" w:w="1407"/>
+            <w:tcBorders>
+              <w:top w:val="single" w:sz="4" w:color="C9C9C9"/>
+              <w:left w:val="single" w:sz="4" w:color="C9C9C9"/>
+              <w:bottom w:val="single" w:sz="4" w:color="C9C9C9"/>
+              <w:right w:val="single" w:sz="4" w:color="C9C9C9"/>
+            </w:tcBorders>
+          </w:tcPr>
+          <w:p>
+            <w:r/>
+            <w:r>
+              <w:rPr>
+                <w:rFonts w:ascii="Times New Roman" w:hAnsi="Times New Roman"/>
+                <w:sz w:val="17"/>
+              </w:rPr>
+              <w:t>86,248.7</w:t>
+            </w:r>
+          </w:p>
+        </w:tc>
+        <w:tc>
+          <w:tcPr>
+            <w:tcW w:type="dxa" w:w="1407"/>
+            <w:tcBorders>
+              <w:top w:val="single" w:sz="4" w:color="C9C9C9"/>
+              <w:left w:val="single" w:sz="4" w:color="C9C9C9"/>
+              <w:bottom w:val="single" w:sz="4" w:color="C9C9C9"/>
+              <w:right w:val="single" w:sz="4" w:color="C9C9C9"/>
+            </w:tcBorders>
+          </w:tcPr>
+          <w:p>
+            <w:r/>
+            <w:r>
+              <w:rPr>
+                <w:rFonts w:ascii="Times New Roman" w:hAnsi="Times New Roman"/>
+                <w:sz w:val="17"/>
+              </w:rPr>
+              <w:t>90,541.1</w:t>
+            </w:r>
+          </w:p>
+        </w:tc>
+        <w:tc>
+          <w:tcPr>
+            <w:tcW w:type="dxa" w:w="1407"/>
+            <w:tcBorders>
+              <w:top w:val="single" w:sz="4" w:color="C9C9C9"/>
+              <w:left w:val="single" w:sz="4" w:color="C9C9C9"/>
+              <w:bottom w:val="single" w:sz="4" w:color="C9C9C9"/>
+              <w:right w:val="single" w:sz="4" w:color="C9C9C9"/>
+            </w:tcBorders>
+          </w:tcPr>
+          <w:p>
+            <w:r/>
+            <w:r>
+              <w:rPr>
+                <w:rFonts w:ascii="Times New Roman" w:hAnsi="Times New Roman"/>
+                <w:sz w:val="17"/>
+              </w:rPr>
+              <w:t>94,833.1</w:t>
+            </w:r>
+          </w:p>
+        </w:tc>
+        <w:tc>
+          <w:tcPr>
+            <w:tcW w:type="dxa" w:w="1407"/>
+            <w:tcBorders>
+              <w:top w:val="single" w:sz="4" w:color="C9C9C9"/>
+              <w:left w:val="single" w:sz="4" w:color="C9C9C9"/>
+              <w:bottom w:val="single" w:sz="4" w:color="C9C9C9"/>
+              <w:right w:val="single" w:sz="4" w:color="C9C9C9"/>
+            </w:tcBorders>
+          </w:tcPr>
+          <w:p>
+            <w:r/>
+            <w:r>
+              <w:rPr>
+                <w:rFonts w:ascii="Times New Roman" w:hAnsi="Times New Roman"/>
+                <w:sz w:val="17"/>
+              </w:rPr>
+              <w:t>No</w:t>
+            </w:r>
+          </w:p>
+        </w:tc>
+      </w:tr>
+      <w:tr>
+        <w:tc>
+          <w:tcPr>
+            <w:tcW w:type="dxa" w:w="1407"/>
+            <w:tcBorders>
+              <w:top w:val="single" w:sz="4" w:color="C9C9C9"/>
+              <w:left w:val="single" w:sz="4" w:color="C9C9C9"/>
+              <w:bottom w:val="single" w:sz="4" w:color="C9C9C9"/>
+              <w:right w:val="single" w:sz="4" w:color="C9C9C9"/>
+            </w:tcBorders>
+          </w:tcPr>
+          <w:p>
+            <w:r/>
+            <w:r>
+              <w:rPr>
+                <w:rFonts w:ascii="Times New Roman" w:hAnsi="Times New Roman"/>
+                <w:sz w:val="17"/>
+              </w:rPr>
+              <w:t>Cataluña</w:t>
+            </w:r>
+          </w:p>
+        </w:tc>
+        <w:tc>
+          <w:tcPr>
+            <w:tcW w:type="dxa" w:w="1407"/>
+            <w:tcBorders>
+              <w:top w:val="single" w:sz="4" w:color="C9C9C9"/>
+              <w:left w:val="single" w:sz="4" w:color="C9C9C9"/>
+              <w:bottom w:val="single" w:sz="4" w:color="C9C9C9"/>
+              <w:right w:val="single" w:sz="4" w:color="C9C9C9"/>
+            </w:tcBorders>
+          </w:tcPr>
+          <w:p>
+            <w:r/>
+            <w:r>
+              <w:rPr>
+                <w:rFonts w:ascii="Times New Roman" w:hAnsi="Times New Roman"/>
+                <w:sz w:val="17"/>
+              </w:rPr>
+              <w:t>SARIMA</w:t>
+            </w:r>
+          </w:p>
+        </w:tc>
+        <w:tc>
+          <w:tcPr>
+            <w:tcW w:type="dxa" w:w="1407"/>
+            <w:tcBorders>
+              <w:top w:val="single" w:sz="4" w:color="C9C9C9"/>
+              <w:left w:val="single" w:sz="4" w:color="C9C9C9"/>
+              <w:bottom w:val="single" w:sz="4" w:color="C9C9C9"/>
+              <w:right w:val="single" w:sz="4" w:color="C9C9C9"/>
+            </w:tcBorders>
+          </w:tcPr>
+          <w:p>
+            <w:r/>
+            <w:r>
+              <w:rPr>
+                <w:rFonts w:ascii="Times New Roman" w:hAnsi="Times New Roman"/>
+                <w:sz w:val="17"/>
+              </w:rPr>
+              <w:t>81,432.4</w:t>
+            </w:r>
+          </w:p>
+        </w:tc>
+        <w:tc>
+          <w:tcPr>
+            <w:tcW w:type="dxa" w:w="1407"/>
+            <w:tcBorders>
+              <w:top w:val="single" w:sz="4" w:color="C9C9C9"/>
+              <w:left w:val="single" w:sz="4" w:color="C9C9C9"/>
+              <w:bottom w:val="single" w:sz="4" w:color="C9C9C9"/>
+              <w:right w:val="single" w:sz="4" w:color="C9C9C9"/>
+            </w:tcBorders>
+          </w:tcPr>
+          <w:p>
+            <w:r/>
+            <w:r>
+              <w:rPr>
+                <w:rFonts w:ascii="Times New Roman" w:hAnsi="Times New Roman"/>
+                <w:sz w:val="17"/>
+              </w:rPr>
+              <w:t>87,818.0</w:t>
+            </w:r>
+          </w:p>
+        </w:tc>
+        <w:tc>
+          <w:tcPr>
+            <w:tcW w:type="dxa" w:w="1407"/>
+            <w:tcBorders>
+              <w:top w:val="single" w:sz="4" w:color="C9C9C9"/>
+              <w:left w:val="single" w:sz="4" w:color="C9C9C9"/>
+              <w:bottom w:val="single" w:sz="4" w:color="C9C9C9"/>
+              <w:right w:val="single" w:sz="4" w:color="C9C9C9"/>
+            </w:tcBorders>
+          </w:tcPr>
+          <w:p>
+            <w:r/>
+            <w:r>
+              <w:rPr>
+                <w:rFonts w:ascii="Times New Roman" w:hAnsi="Times New Roman"/>
+                <w:sz w:val="17"/>
+              </w:rPr>
+              <w:t>91,110.0</w:t>
+            </w:r>
+          </w:p>
+        </w:tc>
+        <w:tc>
+          <w:tcPr>
+            <w:tcW w:type="dxa" w:w="1407"/>
+            <w:tcBorders>
+              <w:top w:val="single" w:sz="4" w:color="C9C9C9"/>
+              <w:left w:val="single" w:sz="4" w:color="C9C9C9"/>
+              <w:bottom w:val="single" w:sz="4" w:color="C9C9C9"/>
+              <w:right w:val="single" w:sz="4" w:color="C9C9C9"/>
+            </w:tcBorders>
+          </w:tcPr>
+          <w:p>
+            <w:r/>
+            <w:r>
+              <w:rPr>
+                <w:rFonts w:ascii="Times New Roman" w:hAnsi="Times New Roman"/>
+                <w:sz w:val="17"/>
+              </w:rPr>
+              <w:t>94,401.8</w:t>
+            </w:r>
+          </w:p>
+        </w:tc>
+        <w:tc>
+          <w:tcPr>
+            <w:tcW w:type="dxa" w:w="1407"/>
+            <w:tcBorders>
+              <w:top w:val="single" w:sz="4" w:color="C9C9C9"/>
+              <w:left w:val="single" w:sz="4" w:color="C9C9C9"/>
+              <w:bottom w:val="single" w:sz="4" w:color="C9C9C9"/>
+              <w:right w:val="single" w:sz="4" w:color="C9C9C9"/>
+            </w:tcBorders>
+          </w:tcPr>
+          <w:p>
+            <w:r/>
+            <w:r>
+              <w:rPr>
+                <w:rFonts w:ascii="Times New Roman" w:hAnsi="Times New Roman"/>
+                <w:sz w:val="17"/>
+              </w:rPr>
+              <w:t>No</w:t>
+            </w:r>
+          </w:p>
+        </w:tc>
+      </w:tr>
+      <w:tr>
+        <w:tc>
+          <w:tcPr>
+            <w:tcW w:type="dxa" w:w="1407"/>
+            <w:tcBorders>
+              <w:top w:val="single" w:sz="4" w:color="C9C9C9"/>
+              <w:left w:val="single" w:sz="4" w:color="C9C9C9"/>
+              <w:bottom w:val="single" w:sz="4" w:color="C9C9C9"/>
+              <w:right w:val="single" w:sz="4" w:color="C9C9C9"/>
+            </w:tcBorders>
+          </w:tcPr>
+          <w:p>
+            <w:r/>
+            <w:r>
+              <w:rPr>
+                <w:rFonts w:ascii="Times New Roman" w:hAnsi="Times New Roman"/>
+                <w:sz w:val="17"/>
+              </w:rPr>
+              <w:t>Andalucía</w:t>
+            </w:r>
+          </w:p>
+        </w:tc>
+        <w:tc>
+          <w:tcPr>
+            <w:tcW w:type="dxa" w:w="1407"/>
+            <w:tcBorders>
+              <w:top w:val="single" w:sz="4" w:color="C9C9C9"/>
+              <w:left w:val="single" w:sz="4" w:color="C9C9C9"/>
+              <w:bottom w:val="single" w:sz="4" w:color="C9C9C9"/>
+              <w:right w:val="single" w:sz="4" w:color="C9C9C9"/>
+            </w:tcBorders>
+          </w:tcPr>
+          <w:p>
+            <w:r/>
+            <w:r>
+              <w:rPr>
+                <w:rFonts w:ascii="Times New Roman" w:hAnsi="Times New Roman"/>
+                <w:sz w:val="17"/>
+              </w:rPr>
+              <w:t>SARIMA</w:t>
+            </w:r>
+          </w:p>
+        </w:tc>
+        <w:tc>
+          <w:tcPr>
+            <w:tcW w:type="dxa" w:w="1407"/>
+            <w:tcBorders>
+              <w:top w:val="single" w:sz="4" w:color="C9C9C9"/>
+              <w:left w:val="single" w:sz="4" w:color="C9C9C9"/>
+              <w:bottom w:val="single" w:sz="4" w:color="C9C9C9"/>
+              <w:right w:val="single" w:sz="4" w:color="C9C9C9"/>
+            </w:tcBorders>
+          </w:tcPr>
+          <w:p>
+            <w:r/>
+            <w:r>
+              <w:rPr>
+                <w:rFonts w:ascii="Times New Roman" w:hAnsi="Times New Roman"/>
+                <w:sz w:val="17"/>
+              </w:rPr>
+              <w:t>50,481.1</w:t>
+            </w:r>
+          </w:p>
+        </w:tc>
+        <w:tc>
+          <w:tcPr>
+            <w:tcW w:type="dxa" w:w="1407"/>
+            <w:tcBorders>
+              <w:top w:val="single" w:sz="4" w:color="C9C9C9"/>
+              <w:left w:val="single" w:sz="4" w:color="C9C9C9"/>
+              <w:bottom w:val="single" w:sz="4" w:color="C9C9C9"/>
+              <w:right w:val="single" w:sz="4" w:color="C9C9C9"/>
+            </w:tcBorders>
+          </w:tcPr>
+          <w:p>
+            <w:r/>
+            <w:r>
+              <w:rPr>
+                <w:rFonts w:ascii="Times New Roman" w:hAnsi="Times New Roman"/>
+                <w:sz w:val="17"/>
+              </w:rPr>
+              <w:t>56,054.5</w:t>
+            </w:r>
+          </w:p>
+        </w:tc>
+        <w:tc>
+          <w:tcPr>
+            <w:tcW w:type="dxa" w:w="1407"/>
+            <w:tcBorders>
+              <w:top w:val="single" w:sz="4" w:color="C9C9C9"/>
+              <w:left w:val="single" w:sz="4" w:color="C9C9C9"/>
+              <w:bottom w:val="single" w:sz="4" w:color="C9C9C9"/>
+              <w:right w:val="single" w:sz="4" w:color="C9C9C9"/>
+            </w:tcBorders>
+          </w:tcPr>
+          <w:p>
+            <w:r/>
+            <w:r>
+              <w:rPr>
+                <w:rFonts w:ascii="Times New Roman" w:hAnsi="Times New Roman"/>
+                <w:sz w:val="17"/>
+              </w:rPr>
+              <w:t>63,116.2</w:t>
+            </w:r>
+          </w:p>
+        </w:tc>
+        <w:tc>
+          <w:tcPr>
+            <w:tcW w:type="dxa" w:w="1407"/>
+            <w:tcBorders>
+              <w:top w:val="single" w:sz="4" w:color="C9C9C9"/>
+              <w:left w:val="single" w:sz="4" w:color="C9C9C9"/>
+              <w:bottom w:val="single" w:sz="4" w:color="C9C9C9"/>
+              <w:right w:val="single" w:sz="4" w:color="C9C9C9"/>
+            </w:tcBorders>
+          </w:tcPr>
+          <w:p>
+            <w:r/>
+            <w:r>
+              <w:rPr>
+                <w:rFonts w:ascii="Times New Roman" w:hAnsi="Times New Roman"/>
+                <w:sz w:val="17"/>
+              </w:rPr>
+              <w:t>70,177.2</w:t>
+            </w:r>
+          </w:p>
+        </w:tc>
+        <w:tc>
+          <w:tcPr>
+            <w:tcW w:type="dxa" w:w="1407"/>
+            <w:tcBorders>
+              <w:top w:val="single" w:sz="4" w:color="C9C9C9"/>
+              <w:left w:val="single" w:sz="4" w:color="C9C9C9"/>
+              <w:bottom w:val="single" w:sz="4" w:color="C9C9C9"/>
+              <w:right w:val="single" w:sz="4" w:color="C9C9C9"/>
+            </w:tcBorders>
+          </w:tcPr>
+          <w:p>
+            <w:r/>
+            <w:r>
+              <w:rPr>
+                <w:rFonts w:ascii="Times New Roman" w:hAnsi="Times New Roman"/>
+                <w:sz w:val="17"/>
+              </w:rPr>
+              <w:t>No</w:t>
+            </w:r>
+          </w:p>
+        </w:tc>
+      </w:tr>
+      <w:tr>
+        <w:tc>
+          <w:tcPr>
+            <w:tcW w:type="dxa" w:w="1407"/>
+            <w:tcBorders>
+              <w:top w:val="single" w:sz="4" w:color="C9C9C9"/>
+              <w:left w:val="single" w:sz="4" w:color="C9C9C9"/>
+              <w:bottom w:val="single" w:sz="4" w:color="C9C9C9"/>
+              <w:right w:val="single" w:sz="4" w:color="C9C9C9"/>
+            </w:tcBorders>
+          </w:tcPr>
+          <w:p>
+            <w:r/>
+            <w:r>
+              <w:rPr>
+                <w:rFonts w:ascii="Times New Roman" w:hAnsi="Times New Roman"/>
+                <w:sz w:val="17"/>
+              </w:rPr>
+              <w:t>Valencia</w:t>
+            </w:r>
+          </w:p>
+        </w:tc>
+        <w:tc>
+          <w:tcPr>
+            <w:tcW w:type="dxa" w:w="1407"/>
+            <w:tcBorders>
+              <w:top w:val="single" w:sz="4" w:color="C9C9C9"/>
+              <w:left w:val="single" w:sz="4" w:color="C9C9C9"/>
+              <w:bottom w:val="single" w:sz="4" w:color="C9C9C9"/>
+              <w:right w:val="single" w:sz="4" w:color="C9C9C9"/>
+            </w:tcBorders>
+          </w:tcPr>
+          <w:p>
+            <w:r/>
+            <w:r>
+              <w:rPr>
+                <w:rFonts w:ascii="Times New Roman" w:hAnsi="Times New Roman"/>
+                <w:sz w:val="17"/>
+              </w:rPr>
+              <w:t>Gompertz</w:t>
+            </w:r>
+          </w:p>
+        </w:tc>
+        <w:tc>
+          <w:tcPr>
+            <w:tcW w:type="dxa" w:w="1407"/>
+            <w:tcBorders>
+              <w:top w:val="single" w:sz="4" w:color="C9C9C9"/>
+              <w:left w:val="single" w:sz="4" w:color="C9C9C9"/>
+              <w:bottom w:val="single" w:sz="4" w:color="C9C9C9"/>
+              <w:right w:val="single" w:sz="4" w:color="C9C9C9"/>
+            </w:tcBorders>
+          </w:tcPr>
+          <w:p>
+            <w:r/>
+            <w:r>
+              <w:rPr>
+                <w:rFonts w:ascii="Times New Roman" w:hAnsi="Times New Roman"/>
+                <w:sz w:val="17"/>
+              </w:rPr>
+              <w:t>38,416.4</w:t>
+            </w:r>
+          </w:p>
+        </w:tc>
+        <w:tc>
+          <w:tcPr>
+            <w:tcW w:type="dxa" w:w="1407"/>
+            <w:tcBorders>
+              <w:top w:val="single" w:sz="4" w:color="C9C9C9"/>
+              <w:left w:val="single" w:sz="4" w:color="C9C9C9"/>
+              <w:bottom w:val="single" w:sz="4" w:color="C9C9C9"/>
+              <w:right w:val="single" w:sz="4" w:color="C9C9C9"/>
+            </w:tcBorders>
+          </w:tcPr>
+          <w:p>
+            <w:r/>
+            <w:r>
+              <w:rPr>
+                <w:rFonts w:ascii="Times New Roman" w:hAnsi="Times New Roman"/>
+                <w:sz w:val="17"/>
+              </w:rPr>
+              <w:t>33,922.8</w:t>
+            </w:r>
+          </w:p>
+        </w:tc>
+        <w:tc>
+          <w:tcPr>
+            <w:tcW w:type="dxa" w:w="1407"/>
+            <w:tcBorders>
+              <w:top w:val="single" w:sz="4" w:color="C9C9C9"/>
+              <w:left w:val="single" w:sz="4" w:color="C9C9C9"/>
+              <w:bottom w:val="single" w:sz="4" w:color="C9C9C9"/>
+              <w:right w:val="single" w:sz="4" w:color="C9C9C9"/>
+            </w:tcBorders>
+          </w:tcPr>
+          <w:p>
+            <w:r/>
+            <w:r>
+              <w:rPr>
+                <w:rFonts w:ascii="Times New Roman" w:hAnsi="Times New Roman"/>
+                <w:sz w:val="17"/>
+              </w:rPr>
+              <w:t>38,416.4</w:t>
+            </w:r>
+          </w:p>
+        </w:tc>
+        <w:tc>
+          <w:tcPr>
+            <w:tcW w:type="dxa" w:w="1407"/>
+            <w:tcBorders>
+              <w:top w:val="single" w:sz="4" w:color="C9C9C9"/>
+              <w:left w:val="single" w:sz="4" w:color="C9C9C9"/>
+              <w:bottom w:val="single" w:sz="4" w:color="C9C9C9"/>
+              <w:right w:val="single" w:sz="4" w:color="C9C9C9"/>
+            </w:tcBorders>
+          </w:tcPr>
+          <w:p>
+            <w:r/>
+            <w:r>
+              <w:rPr>
+                <w:rFonts w:ascii="Times New Roman" w:hAnsi="Times New Roman"/>
+                <w:sz w:val="17"/>
+              </w:rPr>
+              <w:t>42,910.3</w:t>
+            </w:r>
+          </w:p>
+        </w:tc>
+        <w:tc>
+          <w:tcPr>
+            <w:tcW w:type="dxa" w:w="1407"/>
+            <w:tcBorders>
+              <w:top w:val="single" w:sz="4" w:color="C9C9C9"/>
+              <w:left w:val="single" w:sz="4" w:color="C9C9C9"/>
+              <w:bottom w:val="single" w:sz="4" w:color="C9C9C9"/>
+              <w:right w:val="single" w:sz="4" w:color="C9C9C9"/>
+            </w:tcBorders>
+          </w:tcPr>
+          <w:p>
+            <w:r/>
+            <w:r>
+              <w:rPr>
+                <w:rFonts w:ascii="Times New Roman" w:hAnsi="Times New Roman"/>
+                <w:sz w:val="17"/>
+              </w:rPr>
+              <w:t>Yes</w:t>
+            </w:r>
+          </w:p>
+        </w:tc>
+      </w:tr>
+    </w:tbl>
+    <w:p>
+      <w:r>
+        <w:t>Valencia is the only target where production and the mini model genuinely agree. Both independently choose Gompertz (production via training-only walk-forward; the mini model via in-sample R2, 0.940 against Logistic's 0.938), and since both fit the identical Gompertz formula on the identical Consumo_Tm history, the result is byte-identical: production's total equals the mini model's Central scenario exactly. This is a real methodological agreement, not a coincidence.</w:t>
+      </w:r>
+    </w:p>
+    <w:p>
+      <w:r>
+        <w:t>Nacional and Madrid look close, but for the wrong reason. Production's selected model is Logistic for both, but the mini model's own in-sample R2 favors Gompertz for both too (Nacional: 0.956 against Logistic's 0.954; Madrid: 0.947 against Logistic's 0.937). The two methods are not agreeing; they are fitting two different curve families that happen to produce similar-shaped 24-month forecasts for these two series, within roughly 0.1 to 0.3 percent of each other. That is itself a useful, slightly concerning finding: it shows Logistic and Gompertz are barely distinguishable on this data (their in-sample R2 differs by only 0.001 to 0.01), which is the same curve-identifiability risk already raised in Section 5.9. With only 36 monthly points, the data cannot confidently tell two structurally different saturating-curve hypotheses apart, so which curve wins is not a strongly settled question for either method.</w:t>
+      </w:r>
+    </w:p>
+    <w:p>
+      <w:r>
+        <w:t>Cataluña and Andalucía diverge for a structural reason: the mini model cannot produce a SARIMA-shaped forecast at all. It only ever fits a Logistic or Gompertz curve, so for the two targets where the validated, training-only walk-forward process determined that a lag-based SARIMA model fits the actual data better than any smooth growth curve, the mini model's curve-only framework cannot replicate that shape. The gap is real, about 12% for Cataluña and 25% for Andalucía between production and the mini model's Central case, and notably, production's number sits below even the mini model's Conservative scenario for both regions: the validated forecast is more cautious than the narrative model's deliberately low case, not less.</w:t>
+      </w:r>
+    </w:p>
+    <w:p>
+      <w:r>
+        <w:rPr>
+          <w:i/>
+        </w:rPr>
+        <w:t>Takeaway: the mini model is a useful sense-check, not a second opinion that independently confirms the production forecast. It agrees by construction where both methods land on the same curve family, drifts by coincidence where they land on different but similarly-shaped curves, and diverges structurally wherever the validated pipeline selected a non-curve model.</w:t>
       </w:r>
     </w:p>
     <w:p>

</xml_diff>